<commit_message>
Ep 8 kit: per-platform structure, inline image meta, promo card, X single-post; add publish-kit guide
- New docs/CLAUDE-BLOG-PUBLISH-KIT-GUIDE.md: canonical spec for every future long-form article
- Publish kit restructured: CHANNEL POSTS grouped per platform (POST -> IMAGE -> FIRST COMMENT)
- Inline image-meta blocks (file + caption + alt text) at each image
- New social promo card Blog-8-promo-linkedin-fb.png (1.91:1, headline baked in)
- X consolidated to one Premium post (no thread/first-comment)
- Tracker: log Ep 8 Substack/Medium/LinkedIn(x2)/Facebook/X(+$25 boost) + group syndication pending
- Regenerated kit + image-prompts .docx; refreshed Product Hunt playbook dates

Co-Authored-By: Claude Opus 4.8 (1M context) <noreply@anthropic.com>
</commit_message>
<xml_diff>
--- a/docs/exports/blog-episode-8-the-sealed-envelope-PUBLISH-KIT.docx
+++ b/docs/exports/blog-episode-8-the-sealed-envelope-PUBLISH-KIT.docx
@@ -997,15 +997,33 @@
     </w:p>
     <w:p>
       <w:r>
-        <w:t>CHANNEL VARIANTS (post-publish; put the Substack link IN the post this round)</w:t>
+        <w:t>CHANNEL POSTS — workflow per platform: (1) THE POST  ·  (2) IMAGE TO USE  ·  (3) FIRST COMMENT</w:t>
+      </w:r>
+    </w:p>
+    <w:p>
+      <w:r>
+        <w:t>Put the Substack link IN the post body this round. Post the FIRST COMMENT immediately after publishing.</w:t>
       </w:r>
     </w:p>
     <w:p>
       <w:pPr>
-        <w:pStyle w:val="Heading3"/>
+        <w:pStyle w:val="Heading2"/>
       </w:pPr>
       <w:r>
-        <w:t>LinkedIn (~280w; link in post)</w:t>
+        <w:t>LINKEDIN</w:t>
+      </w:r>
+    </w:p>
+    <w:p>
+      <w:pPr>
+        <w:spacing w:before="120"/>
+      </w:pPr>
+      <w:r>
+        <w:rPr>
+          <w:b/>
+          <w:color w:val="0D9D8A"/>
+          <w:sz w:val="21"/>
+        </w:rPr>
+        <w:t>▸ (1) THE POST  (~280w; Substack link in the post body):</w:t>
       </w:r>
     </w:p>
     <w:p>
@@ -1079,10 +1097,180 @@
     </w:p>
     <w:p>
       <w:pPr>
-        <w:pStyle w:val="Heading3"/>
+        <w:spacing w:before="120"/>
       </w:pPr>
       <w:r>
-        <w:t>X / Twitter (single tweet + sealed-envelope image; link in tweet)</w:t>
+        <w:rPr>
+          <w:b/>
+          <w:color w:val="0D9D8A"/>
+          <w:sz w:val="21"/>
+        </w:rPr>
+        <w:t>▸ (2) IMAGE TO ATTACH:  Blog-8-promo-linkedin-fb.png  (1.91:1, headline baked in — best for the feed)</w:t>
+      </w:r>
+    </w:p>
+    <w:p>
+      <w:r>
+        <w:t>Alt: Blog-8-hero-sealed-envelope.png (plain hero, no text).  Folder: docs/images/episode-8/</w:t>
+      </w:r>
+    </w:p>
+    <w:p>
+      <w:pPr>
+        <w:spacing w:before="120"/>
+      </w:pPr>
+      <w:r>
+        <w:rPr>
+          <w:b/>
+          <w:color w:val="0D9D8A"/>
+          <w:sz w:val="21"/>
+        </w:rPr>
+        <w:t>▸ (3) FIRST COMMENT  (post immediately after):</w:t>
+      </w:r>
+    </w:p>
+    <w:p>
+      <w:r>
+        <w:t>Quick gut-check 👇 take the stock you've owned the longest — can you say, in one sentence, the real reason you bought it?</w:t>
+      </w:r>
+    </w:p>
+    <w:p>
+      <w:r>
+        <w:t>If you can't, that's exactly what the Executive Summary is for: it writes the thesis for you — verdict, confidence, and the numbers behind it — and one click saves it as a dated PDF you can reopen in six months.</w:t>
+      </w:r>
+    </w:p>
+    <w:p>
+      <w:r>
+        <w:t>Try it free (3 analyses, no card): https://aistockassist.com</w:t>
+      </w:r>
+    </w:p>
+    <w:p>
+      <w:r>
+        <w:t>New here? Catch up on the whole series: https://aistockassist.com/?view=learn</w:t>
+      </w:r>
+    </w:p>
+    <w:p>
+      <w:pPr>
+        <w:pStyle w:val="Heading2"/>
+      </w:pPr>
+      <w:r>
+        <w:t>FACEBOOK</w:t>
+      </w:r>
+    </w:p>
+    <w:p>
+      <w:pPr>
+        <w:spacing w:before="120"/>
+      </w:pPr>
+      <w:r>
+        <w:rPr>
+          <w:b/>
+          <w:color w:val="0D9D8A"/>
+          <w:sz w:val="21"/>
+        </w:rPr>
+        <w:t>▸ (1) THE POST  (~200w; Substack link in the post body):</w:t>
+      </w:r>
+    </w:p>
+    <w:p>
+      <w:r>
+        <w:t>Here's a question that quietly ruins a lot of investors: "Why did you buy that stock?"</w:t>
+      </w:r>
+    </w:p>
+    <w:p>
+      <w:r>
+        <w:t>Not "did it go up." Why you bought it — the actual reasoning, the day you clicked buy.</w:t>
+      </w:r>
+    </w:p>
+    <w:p>
+      <w:r>
+        <w:t>A friend got asked exactly this by his wife, about an $8,000 position he'd held for six months on a tip from his cousin. He couldn't answer. He remembered being excited. He couldn't name one reason. And now he couldn't decide whether to sell or double down, because he had nothing to check against.</w:t>
+      </w:r>
+    </w:p>
+    <w:p>
+      <w:r>
+        <w:t>That's not carelessness. It's how memory works — six months later you keep the feeling and lose the reasoning, and your brain rewrites the story to match how it turned out.</w:t>
+      </w:r>
+    </w:p>
+    <w:p>
+      <w:r>
+        <w:t>In this episode, Alex shows him the fix: run the stock through AI Stock Assist, and the Executive Summary writes the thesis for you — a verdict in plain English, the confidence, and the numbers behind it. One click saves it as a dated PDF. A sealed envelope you open later to ask: was I wrong, or did the world change?</w:t>
+      </w:r>
+    </w:p>
+    <w:p>
+      <w:r>
+        <w:t>3 free analyses, no credit card. (Illustrative, not advice.)</w:t>
+      </w:r>
+    </w:p>
+    <w:p>
+      <w:r>
+        <w:rPr>
+          <w:color w:val="0D9D8A"/>
+          <w:sz w:val="20"/>
+        </w:rPr>
+        <w:t>https://lindsayhiebert.substack.com/p/the-sealed-envelope</w:t>
+      </w:r>
+    </w:p>
+    <w:p>
+      <w:pPr>
+        <w:spacing w:before="120"/>
+      </w:pPr>
+      <w:r>
+        <w:rPr>
+          <w:b/>
+          <w:color w:val="0D9D8A"/>
+          <w:sz w:val="21"/>
+        </w:rPr>
+        <w:t>▸ (2) IMAGE TO ATTACH:  Blog-8-promo-linkedin-fb.png  (1.91:1, headline baked in)</w:t>
+      </w:r>
+    </w:p>
+    <w:p>
+      <w:r>
+        <w:t>Alt: Blog-8-hero-sealed-envelope-OG-1200x630.jpg (clean 1200x630).  Folder: docs/images/episode-8/</w:t>
+      </w:r>
+    </w:p>
+    <w:p>
+      <w:pPr>
+        <w:spacing w:before="120"/>
+      </w:pPr>
+      <w:r>
+        <w:rPr>
+          <w:b/>
+          <w:color w:val="0D9D8A"/>
+          <w:sz w:val="21"/>
+        </w:rPr>
+        <w:t>▸ (3) FIRST COMMENT  (post immediately after):</w:t>
+      </w:r>
+    </w:p>
+    <w:p>
+      <w:r>
+        <w:t>Want to seal your own envelope? Type a stock you already own into AI Stock Assist, read the Executive Summary, and hit Download PDF — a dated thesis you can reopen in six months.</w:t>
+      </w:r>
+    </w:p>
+    <w:p>
+      <w:r>
+        <w:t>3 free analyses, no card → https://aistockassist.com</w:t>
+      </w:r>
+    </w:p>
+    <w:p>
+      <w:r>
+        <w:t>New to the series? Start at Episode 0 and catch up on all eight → https://aistockassist.com/?view=learn</w:t>
+      </w:r>
+    </w:p>
+    <w:p>
+      <w:pPr>
+        <w:pStyle w:val="Heading2"/>
+      </w:pPr>
+      <w:r>
+        <w:t>X / TWITTER</w:t>
+      </w:r>
+    </w:p>
+    <w:p>
+      <w:pPr>
+        <w:spacing w:before="120"/>
+      </w:pPr>
+      <w:r>
+        <w:rPr>
+          <w:b/>
+          <w:color w:val="0D9D8A"/>
+          <w:sz w:val="21"/>
+        </w:rPr>
+        <w:t>▸ (1) THE POST  (single tweet; link in the tweet):</w:t>
       </w:r>
     </w:p>
     <w:p>
@@ -1121,10 +1309,55 @@
     </w:p>
     <w:p>
       <w:pPr>
-        <w:pStyle w:val="Heading3"/>
+        <w:spacing w:before="120"/>
       </w:pPr>
       <w:r>
-        <w:t>X / Twitter (optional 2-tweet version)</w:t>
+        <w:rPr>
+          <w:b/>
+          <w:color w:val="0D9D8A"/>
+          <w:sz w:val="21"/>
+        </w:rPr>
+        <w:t>▸ (2) IMAGE TO ATTACH:  Blog-8-hero-sealed-envelope.png  (16:9).  Folder: docs/images/episode-8/</w:t>
+      </w:r>
+    </w:p>
+    <w:p>
+      <w:pPr>
+        <w:spacing w:before="120"/>
+      </w:pPr>
+      <w:r>
+        <w:rPr>
+          <w:b/>
+          <w:color w:val="0D9D8A"/>
+          <w:sz w:val="21"/>
+        </w:rPr>
+        <w:t>▸ (3) FIRST COMMENT  (reply to your own tweet):</w:t>
+      </w:r>
+    </w:p>
+    <w:p>
+      <w:r>
+        <w:t>The fix is a dated record, not better memory. AI Stock Assist writes the verdict + the numbers behind it, and one click saves the PDF. 3 free, no card →</w:t>
+      </w:r>
+    </w:p>
+    <w:p>
+      <w:r>
+        <w:rPr>
+          <w:color w:val="0D9D8A"/>
+          <w:sz w:val="20"/>
+        </w:rPr>
+        <w:t>https://aistockassist.com</w:t>
+      </w:r>
+    </w:p>
+    <w:p>
+      <w:pPr>
+        <w:spacing w:before="120"/>
+      </w:pPr>
+      <w:r>
+        <w:rPr>
+          <w:b/>
+          <w:color w:val="0D9D8A"/>
+          <w:sz w:val="21"/>
+        </w:rPr>
+        <w:t>▸ OPTIONAL — 2-TWEET VERSION (use instead of the single tweet):</w:t>
       </w:r>
     </w:p>
     <w:p>
@@ -1174,61 +1407,32 @@
     </w:p>
     <w:p>
       <w:pPr>
-        <w:pStyle w:val="Heading3"/>
+        <w:pStyle w:val="Heading2"/>
       </w:pPr>
       <w:r>
-        <w:t>Facebook (~200w; link in post)</w:t>
+        <w:t>REDDIT  (r/investing primary, r/stocks alt)</w:t>
       </w:r>
     </w:p>
     <w:p>
+      <w:pPr>
+        <w:spacing w:before="120"/>
+      </w:pPr>
       <w:r>
-        <w:t>Here's a question that quietly ruins a lot of investors: "Why did you buy that stock?"</w:t>
-      </w:r>
-    </w:p>
-    <w:p>
-      <w:r>
-        <w:t>Not "did it go up." Why you bought it — the actual reasoning, the day you clicked buy.</w:t>
-      </w:r>
-    </w:p>
-    <w:p>
-      <w:r>
-        <w:t>A friend got asked exactly this by his wife, about an $8,000 position he'd held for six months on a tip from his cousin. He couldn't answer. He remembered being excited. He couldn't name one reason. And now he couldn't decide whether to sell or double down, because he had nothing to check against.</w:t>
-      </w:r>
-    </w:p>
-    <w:p>
-      <w:r>
-        <w:t>That's not carelessness. It's how memory works — six months later you keep the feeling and lose the reasoning, and your brain rewrites the story to match how it turned out.</w:t>
-      </w:r>
-    </w:p>
-    <w:p>
-      <w:r>
-        <w:t>In this episode, Alex shows him the fix: run the stock through AI Stock Assist, and the Executive Summary writes the thesis for you — a verdict in plain English, the confidence, and the numbers behind it. One click saves it as a dated PDF. A sealed envelope you open later to ask: was I wrong, or did the world change?</w:t>
-      </w:r>
-    </w:p>
-    <w:p>
-      <w:r>
-        <w:t>3 free analyses, no credit card. (Illustrative, not advice.)</w:t>
+        <w:rPr>
+          <w:b/>
+          <w:color w:val="0D9D8A"/>
+          <w:sz w:val="21"/>
+        </w:rPr>
+        <w:t>▸ (1) THE POST  (TEXT self-post; NO link, NO product mention; no image):</w:t>
       </w:r>
     </w:p>
     <w:p>
       <w:r>
         <w:rPr>
-          <w:color w:val="0D9D8A"/>
-          <w:sz w:val="20"/>
+          <w:i/>
+          <w:color w:val="6B7280"/>
+          <w:sz w:val="18"/>
         </w:rPr>
-        <w:t>https://lindsayhiebert.substack.com/p/the-sealed-envelope</w:t>
-      </w:r>
-    </w:p>
-    <w:p>
-      <w:pPr>
-        <w:pStyle w:val="Heading3"/>
-      </w:pPr>
-      <w:r>
-        <w:t>Reddit (r/investing primary, r/stocks alt; TEXT post, NO link, NO product mention)</w:t>
-      </w:r>
-    </w:p>
-    <w:p>
-      <w:r>
         <w:t>NOTE: honest discussion-first format — no fabricated "a friend" anecdote (the blog parable is illustrative, and Reddit punishes inauthentic personal stories). Lead with a genuine thought-experiment + real questions. Reply to comments in your own voice; do not drop the link.</w:t>
       </w:r>
     </w:p>
@@ -1271,70 +1475,29 @@
       </w:r>
     </w:p>
     <w:p>
+      <w:pPr>
+        <w:spacing w:before="120"/>
+      </w:pPr>
       <w:r>
-        <w:t>FIRST COMMENTS (post immediately after, to drive the funnel + early engagement)</w:t>
+        <w:rPr>
+          <w:b/>
+          <w:color w:val="0D9D8A"/>
+          <w:sz w:val="21"/>
+        </w:rPr>
+        <w:t>▸ (2) IMAGE:  none — a text self-post performs best here.</w:t>
       </w:r>
     </w:p>
     <w:p>
       <w:pPr>
-        <w:pStyle w:val="Heading3"/>
+        <w:spacing w:before="120"/>
       </w:pPr>
       <w:r>
-        <w:t>LinkedIn first comment</w:t>
-      </w:r>
-    </w:p>
-    <w:p>
-      <w:r>
-        <w:t>Quick gut-check: pick the stock you've owned the longest — can you state, in one sentence, the real reason you bought it?</w:t>
-      </w:r>
-    </w:p>
-    <w:p>
-      <w:r>
-        <w:t>If you can't, that's exactly what the Executive Summary is for: it writes the thesis for you and you save it as a dated PDF. 3 free analyses, no credit card:</w:t>
-      </w:r>
-    </w:p>
-    <w:p>
-      <w:r>
         <w:rPr>
+          <w:b/>
           <w:color w:val="0D9D8A"/>
-          <w:sz w:val="20"/>
+          <w:sz w:val="21"/>
         </w:rPr>
-        <w:t>https://aistockassist.com</w:t>
-      </w:r>
-    </w:p>
-    <w:p>
-      <w:pPr>
-        <w:pStyle w:val="Heading3"/>
-      </w:pPr>
-      <w:r>
-        <w:t>Facebook first comment</w:t>
-      </w:r>
-    </w:p>
-    <w:p>
-      <w:r>
-        <w:t>If you want to seal your own envelope: type a ticker you own into AI Stock Assist, read the Executive Summary, and hit Download PDF to save a dated thesis you can reopen in six months. 3 free, no card → https://aistockassist.com</w:t>
-      </w:r>
-    </w:p>
-    <w:p>
-      <w:pPr>
-        <w:pStyle w:val="Heading3"/>
-      </w:pPr>
-      <w:r>
-        <w:t>X first comment (reply to your own tweet)</w:t>
-      </w:r>
-    </w:p>
-    <w:p>
-      <w:r>
-        <w:t>The fix is a dated record, not better memory. AI Stock Assist writes the verdict + the numbers behind it, and one click saves the PDF. 3 free, no card →</w:t>
-      </w:r>
-    </w:p>
-    <w:p>
-      <w:r>
-        <w:rPr>
-          <w:color w:val="0D9D8A"/>
-          <w:sz w:val="20"/>
-        </w:rPr>
-        <w:t>https://aistockassist.com</w:t>
+        <w:t>▸ (3) FIRST COMMENT:  none — reply to commenters in your own voice; never drop the link.</w:t>
       </w:r>
     </w:p>
     <w:p>
@@ -1344,7 +1507,52 @@
     </w:p>
     <w:p>
       <w:r>
-        <w:t>(prompts: docs/episode-8-the-sealed-envelope-image-prompts.md · all canonical files are 16:9 landscape, 1672x941)</w:t>
+        <w:t>(prompts: docs/episode-8-the-sealed-envelope-image-prompts.md · all files are landscape — never square/portrait)</w:t>
+      </w:r>
+    </w:p>
+    <w:p>
+      <w:r>
+        <w:t>WHICH IMAGE TO USE PER PLATFORM (the hero / attached image):</w:t>
+      </w:r>
+    </w:p>
+    <w:p>
+      <w:pPr>
+        <w:pStyle w:val="ListBullet"/>
+      </w:pPr>
+      <w:r>
+        <w:t>Substack — header + first inline image: Blog-8-hero-sealed-envelope.png (16:9)</w:t>
+      </w:r>
+    </w:p>
+    <w:p>
+      <w:pPr>
+        <w:pStyle w:val="ListBullet"/>
+      </w:pPr>
+      <w:r>
+        <w:t>Medium — featured image: Blog-8-hero-sealed-envelope.png (16:9)</w:t>
+      </w:r>
+    </w:p>
+    <w:p>
+      <w:pPr>
+        <w:pStyle w:val="ListBullet"/>
+      </w:pPr>
+      <w:r>
+        <w:t>LinkedIn — attach: Blog-8-promo-linkedin-fb.png (1.91:1, headline baked in) — or the plain hero if you want no text</w:t>
+      </w:r>
+    </w:p>
+    <w:p>
+      <w:pPr>
+        <w:pStyle w:val="ListBullet"/>
+      </w:pPr>
+      <w:r>
+        <w:t>Facebook — attach: Blog-8-promo-linkedin-fb.png (1.91:1) — or Blog-8-hero-sealed-envelope-OG-1200x630.jpg</w:t>
+      </w:r>
+    </w:p>
+    <w:p>
+      <w:pPr>
+        <w:pStyle w:val="ListBullet"/>
+      </w:pPr>
+      <w:r>
+        <w:t>X / Twitter — in-tweet image: Blog-8-hero-sealed-envelope.png (16:9)</w:t>
       </w:r>
     </w:p>
     <w:p>
@@ -1378,7 +1586,20 @@
     </w:p>
     <w:p>
       <w:r>
-        <w:t>SOCIAL LINK CARD (OG — for LinkedIn/Facebook URL unfurl):</w:t>
+        <w:t>SOCIAL PROMO CARD (headline baked in — best for LinkedIn + Facebook feed):</w:t>
+      </w:r>
+    </w:p>
+    <w:p>
+      <w:pPr>
+        <w:pStyle w:val="ListBullet"/>
+      </w:pPr>
+      <w:r>
+        <w:t>docs/images/episode-8/Blog-8-promo-linkedin-fb.png — 1.91:1 (1734x907). Sealed-envelope still-life + headline "WHAT DID YOU BELIEVE THE DAY YOU BOUGHT?" / "If you didn't write it down, you don't actually know." + diamond logo.</w:t>
+      </w:r>
+    </w:p>
+    <w:p>
+      <w:r>
+        <w:t>SOCIAL LINK CARD (OG — for LinkedIn/Facebook URL unfurl when the link is in the body):</w:t>
       </w:r>
     </w:p>
     <w:p>

</xml_diff>